<commit_message>
pushed to origin main
</commit_message>
<xml_diff>
--- a/Androsov_Maksim_lb4/src/report.docx
+++ b/Androsov_Maksim_lb4/src/report.docx
@@ -458,8 +458,8 @@
         </w:tblCellMar>
       </w:tblPr>
       <w:tblGrid>
-        <w:gridCol w:w="4340"/>
-        <w:gridCol w:w="2611"/>
+        <w:gridCol w:w="4339"/>
+        <w:gridCol w:w="2612"/>
         <w:gridCol w:w="2903"/>
       </w:tblGrid>
       <w:tr>
@@ -468,7 +468,7 @@
         </w:trPr>
         <w:tc>
           <w:tcPr>
-            <w:tcW w:w="4340" w:type="dxa"/>
+            <w:tcW w:w="4339" w:type="dxa"/>
             <w:tcBorders/>
             <w:vAlign w:val="bottom"/>
           </w:tcPr>
@@ -494,7 +494,7 @@
         </w:tc>
         <w:tc>
           <w:tcPr>
-            <w:tcW w:w="2611" w:type="dxa"/>
+            <w:tcW w:w="2612" w:type="dxa"/>
             <w:tcBorders>
               <w:bottom w:val="single" w:sz="4" w:space="0" w:color="000000"/>
             </w:tcBorders>
@@ -544,7 +544,7 @@
         </w:trPr>
         <w:tc>
           <w:tcPr>
-            <w:tcW w:w="4340" w:type="dxa"/>
+            <w:tcW w:w="4339" w:type="dxa"/>
             <w:tcBorders/>
             <w:vAlign w:val="bottom"/>
           </w:tcPr>
@@ -565,7 +565,7 @@
         </w:tc>
         <w:tc>
           <w:tcPr>
-            <w:tcW w:w="2611" w:type="dxa"/>
+            <w:tcW w:w="2612" w:type="dxa"/>
             <w:tcBorders>
               <w:top w:val="single" w:sz="4" w:space="0" w:color="000000"/>
               <w:bottom w:val="single" w:sz="4" w:space="0" w:color="000000"/>
@@ -1053,7 +1053,29 @@
           <w:szCs w:val="24"/>
           <w:lang w:val="ru-RU" w:eastAsia="zh-CN" w:bidi="hi-IN"/>
         </w:rPr>
-        <w:t>Для каждого i от 1 до  n-1.  J = arr[i-1] — длина префикса-суффикса для предыдущей позиции. Пока символы не равны(p[i] != p[j]) и j &gt; 0  ,  j сдвигается к меньшему префиксу j = arr[j-1]. Если символы ранвы (p[i] == p[j]) , j сдвигается на позицию вперед.(j+=1) и это значение присваивается текущему элементу массива arr[i] = j.</w:t>
+        <w:t>Для каждого i от 1 до  n-1.  J = arr[i-1] — длина префикса-суффикса для предыдущей позиции. Пока символы не равны(p[i] != p[j]) и j &gt; 0  ,  j сдвигается к меньшему префиксу j = arr[j-1]. Если символы рав</w:t>
+      </w:r>
+      <w:r>
+        <w:rPr>
+          <w:rFonts w:eastAsia="Times New Roman" w:cs="Times New Roman"/>
+          <w:color w:val="auto"/>
+          <w:kern w:val="2"/>
+          <w:sz w:val="28"/>
+          <w:szCs w:val="24"/>
+          <w:lang w:val="ru-RU" w:eastAsia="zh-CN" w:bidi="hi-IN"/>
+        </w:rPr>
+        <w:t>н</w:t>
+      </w:r>
+      <w:r>
+        <w:rPr>
+          <w:rFonts w:eastAsia="Times New Roman" w:cs="Times New Roman"/>
+          <w:color w:val="auto"/>
+          <w:kern w:val="2"/>
+          <w:sz w:val="28"/>
+          <w:szCs w:val="24"/>
+          <w:lang w:val="ru-RU" w:eastAsia="zh-CN" w:bidi="hi-IN"/>
+        </w:rPr>
+        <w:t>ы (p[i] == p[j]) , j сдвигается на позицию вперед.(j+=1) и это значение присваивается текущему элементу массива arr[i] = j.</w:t>
       </w:r>
     </w:p>
     <w:p>

</xml_diff>